<commit_message>
Add catatan_hasil, kendala, solusi to Perjadin template and UI
</commit_message>
<xml_diff>
--- a/template/template_laporan_perjadin.docx
+++ b/template/template_laporan_perjadin.docx
@@ -1300,6 +1300,21 @@
           <w:szCs w:val="24"/>
         </w:rPr>
         <w:t xml:space="preserve"> </w:t>
+      </w:r>
+    </w:p>
+    <w:p>
+      <w:r>
+        <w:t>Cat Hasil Pendataan : {{ catatan_hasil }}</w:t>
+      </w:r>
+    </w:p>
+    <w:p>
+      <w:r>
+        <w:t>Kendala             : {{ kendala }}</w:t>
+      </w:r>
+    </w:p>
+    <w:p>
+      <w:r>
+        <w:t>Solusi              : {{ solusi }}</w:t>
       </w:r>
     </w:p>
     <w:p>

</xml_diff>

<commit_message>
Add Nama Kegiatan input to Perjadin form
</commit_message>
<xml_diff>
--- a/template/template_laporan_perjadin.docx
+++ b/template/template_laporan_perjadin.docx
@@ -1303,21 +1303,6 @@
       </w:r>
     </w:p>
     <w:p>
-      <w:r>
-        <w:t>Cat Hasil Pendataan : {{ catatan_hasil }}</w:t>
-      </w:r>
-    </w:p>
-    <w:p>
-      <w:r>
-        <w:t>Kendala             : {{ kendala }}</w:t>
-      </w:r>
-    </w:p>
-    <w:p>
-      <w:r>
-        <w:t>Solusi              : {{ solusi }}</w:t>
-      </w:r>
-    </w:p>
-    <w:p>
       <w:pPr>
         <w:spacing w:after="0" w:line="240" w:lineRule="auto"/>
         <w:rPr>
@@ -3393,6 +3378,7 @@
         <w:ind w:left="4320" w:right="549"/>
         <w:jc w:val="center"/>
         <w:rPr>
+          <w:rFonts w:ascii="Times New Roman" w:hAnsi="Times New Roman" w:cs="Times New Roman"/>
           <w:sz w:val="24"/>
           <w:szCs w:val="24"/>
         </w:rPr>
@@ -3426,6 +3412,7 @@
       <w:proofErr w:type="gramStart"/>
       <w:r>
         <w:rPr>
+          <w:rFonts w:ascii="Times New Roman" w:hAnsi="Times New Roman" w:cs="Times New Roman"/>
           <w:sz w:val="24"/>
           <w:szCs w:val="24"/>
         </w:rPr>
@@ -3434,6 +3421,7 @@
       <w:proofErr w:type="spellStart"/>
       <w:r>
         <w:rPr>
+          <w:rFonts w:ascii="Times New Roman" w:hAnsi="Times New Roman" w:cs="Times New Roman"/>
           <w:sz w:val="24"/>
           <w:szCs w:val="24"/>
         </w:rPr>
@@ -3442,6 +3430,7 @@
       <w:proofErr w:type="gramEnd"/>
       <w:r>
         <w:rPr>
+          <w:rFonts w:ascii="Times New Roman" w:hAnsi="Times New Roman" w:cs="Times New Roman"/>
           <w:sz w:val="24"/>
           <w:szCs w:val="24"/>
         </w:rPr>
@@ -3450,6 +3439,7 @@
       <w:proofErr w:type="spellEnd"/>
       <w:r>
         <w:rPr>
+          <w:rFonts w:ascii="Times New Roman" w:hAnsi="Times New Roman" w:cs="Times New Roman"/>
           <w:sz w:val="24"/>
           <w:szCs w:val="24"/>
         </w:rPr>

</xml_diff>

<commit_message>
Uppercase kegiatan in Perjadin, fix documentation grid to fit one page
</commit_message>
<xml_diff>
--- a/template/template_laporan_perjadin.docx
+++ b/template/template_laporan_perjadin.docx
@@ -3375,7 +3375,7 @@
     </w:p>
     <w:p>
       <w:pPr>
-        <w:ind w:left="4320" w:right="549"/>
+        <w:ind w:left="4320" w:right="116"/>
         <w:jc w:val="center"/>
         <w:rPr>
           <w:rFonts w:ascii="Times New Roman" w:hAnsi="Times New Roman" w:cs="Times New Roman"/>
@@ -3448,7 +3448,7 @@
     </w:p>
     <w:p>
       <w:pPr>
-        <w:ind w:left="4320" w:right="76"/>
+        <w:ind w:left="4320" w:right="116"/>
         <w:jc w:val="center"/>
         <w:rPr>
           <w:sz w:val="24"/>
@@ -3760,7 +3760,7 @@
     <w:p>
       <w:pPr>
         <w:spacing w:before="1" w:line="180" w:lineRule="exact"/>
-        <w:ind w:left="4320"/>
+        <w:ind w:left="4320" w:right="116"/>
         <w:jc w:val="center"/>
         <w:rPr>
           <w:sz w:val="18"/>
@@ -3771,21 +3771,21 @@
     <w:p>
       <w:pPr>
         <w:spacing w:line="200" w:lineRule="exact"/>
-        <w:ind w:left="4320"/>
+        <w:ind w:left="4320" w:right="116"/>
         <w:jc w:val="center"/>
       </w:pPr>
     </w:p>
     <w:p>
       <w:pPr>
         <w:spacing w:line="200" w:lineRule="exact"/>
-        <w:ind w:left="4320"/>
+        <w:ind w:left="4320" w:right="116"/>
         <w:jc w:val="center"/>
       </w:pPr>
     </w:p>
     <w:p>
       <w:pPr>
         <w:spacing w:after="0" w:line="240" w:lineRule="auto"/>
-        <w:ind w:left="4320"/>
+        <w:ind w:left="4320" w:right="116"/>
         <w:jc w:val="center"/>
         <w:rPr>
           <w:sz w:val="24"/>

</xml_diff>

<commit_message>
Fix trHeight units (twips not EMU), compact grid to fit one page
</commit_message>
<xml_diff>
--- a/template/template_laporan_perjadin.docx
+++ b/template/template_laporan_perjadin.docx
@@ -938,6 +938,14 @@
       <w:tblPr>
         <w:tblStyle w:val="TableGrid"/>
         <w:tblW w:w="0" w:type="auto"/>
+        <w:tblBorders>
+          <w:top w:val="none" w:sz="0" w:space="0" w:color="auto"/>
+          <w:left w:val="none" w:sz="0" w:space="0" w:color="auto"/>
+          <w:bottom w:val="none" w:sz="0" w:space="0" w:color="auto"/>
+          <w:right w:val="none" w:sz="0" w:space="0" w:color="auto"/>
+          <w:insideH w:val="none" w:sz="0" w:space="0" w:color="auto"/>
+          <w:insideV w:val="none" w:sz="0" w:space="0" w:color="auto"/>
+        </w:tblBorders>
         <w:tblLook w:val="04A0" w:firstRow="1" w:lastRow="0" w:firstColumn="1" w:lastColumn="0" w:noHBand="0" w:noVBand="1"/>
       </w:tblPr>
       <w:tblGrid>

</xml_diff>